<commit_message>
Keep diagnostic sessions working with theme codes
`themes.code` links a trainer session to its textbook section, but a
diagnostic attempt spans several themes, so it has no single code: the
new required `themeCode` broke the build in three diagnostic files.

`themeCode` is now `string | null`; diagnostic passes null and the theme
name renders as plain text instead of a textbook link, matching what the
summary already did for diagnostic attempts.

Migration renumbered 008 -> 010: `dev` already ships a different 008.

Co-authored-by: Cursor <cursoragent@cursor.com>
</commit_message>
<xml_diff>
--- a/docs/Goldener-Rechner-beklog-PM.docx
+++ b/docs/Goldener-Rechner-beklog-PM.docx
@@ -9403,6 +9403,124 @@
               <w:bottom w:val="single" w:color="D2C7AE" w:sz="4"/>
               <w:right w:val="single" w:color="D2C7AE" w:sz="4"/>
             </w:tcBorders>
+            <w:shd w:fill="FDFBF4" w:val="clear"/>
+            <w:vAlign w:val="center"/>
+          </w:tcPr>
+          <w:p>
+            <w:pPr>
+              <w:spacing w:after="40" w:before="40"/>
+            </w:pPr>
+            <w:r>
+              <w:rPr>
+                <w:rFonts w:ascii="Calibri" w:cs="Calibri" w:eastAsia="Calibri" w:hAnsi="Calibri"/>
+                <w:b w:val="false"/>
+                <w:bCs w:val="false"/>
+                <w:color w:val="1F2320"/>
+                <w:sz w:val="18"/>
+                <w:szCs w:val="18"/>
+              </w:rPr>
+              <w:t xml:space="preserve">Підручник з темами БД</w:t>
+            </w:r>
+          </w:p>
+        </w:tc>
+        <w:tc>
+          <w:tcPr>
+            <w:tcW w:type="pct" w:w="25%"/>
+            <w:tcBorders>
+              <w:top w:val="single" w:color="D2C7AE" w:sz="4"/>
+              <w:left w:val="single" w:color="D2C7AE" w:sz="4"/>
+              <w:bottom w:val="single" w:color="D2C7AE" w:sz="4"/>
+              <w:right w:val="single" w:color="D2C7AE" w:sz="4"/>
+            </w:tcBorders>
+            <w:shd w:fill="FDFBF4" w:val="clear"/>
+            <w:vAlign w:val="center"/>
+          </w:tcPr>
+          <w:p>
+            <w:pPr>
+              <w:spacing w:after="40" w:before="40"/>
+            </w:pPr>
+            <w:r>
+              <w:rPr>
+                <w:rFonts w:ascii="Calibri" w:cs="Calibri" w:eastAsia="Calibri" w:hAnsi="Calibri"/>
+                <w:b w:val="false"/>
+                <w:bCs w:val="false"/>
+                <w:color w:val="1F2320"/>
+                <w:sz w:val="18"/>
+                <w:szCs w:val="18"/>
+              </w:rPr>
+              <w:t xml:space="preserve">Готово</w:t>
+            </w:r>
+          </w:p>
+        </w:tc>
+        <w:tc>
+          <w:tcPr>
+            <w:tcW w:type="pct" w:w="25%"/>
+            <w:tcBorders>
+              <w:top w:val="single" w:color="D2C7AE" w:sz="4"/>
+              <w:left w:val="single" w:color="D2C7AE" w:sz="4"/>
+              <w:bottom w:val="single" w:color="D2C7AE" w:sz="4"/>
+              <w:right w:val="single" w:color="D2C7AE" w:sz="4"/>
+            </w:tcBorders>
+            <w:shd w:fill="FDFBF4" w:val="clear"/>
+            <w:vAlign w:val="center"/>
+          </w:tcPr>
+          <w:p>
+            <w:pPr>
+              <w:spacing w:after="40" w:before="40"/>
+            </w:pPr>
+            <w:r>
+              <w:rPr>
+                <w:rFonts w:ascii="Calibri" w:cs="Calibri" w:eastAsia="Calibri" w:hAnsi="Calibri"/>
+                <w:b w:val="false"/>
+                <w:bCs w:val="false"/>
+                <w:color w:val="1F2320"/>
+                <w:sz w:val="18"/>
+                <w:szCs w:val="18"/>
+              </w:rPr>
+              <w:t xml:space="preserve">Марія</w:t>
+            </w:r>
+          </w:p>
+        </w:tc>
+        <w:tc>
+          <w:tcPr>
+            <w:tcW w:type="pct" w:w="25%"/>
+            <w:tcBorders>
+              <w:top w:val="single" w:color="D2C7AE" w:sz="4"/>
+              <w:left w:val="single" w:color="D2C7AE" w:sz="4"/>
+              <w:bottom w:val="single" w:color="D2C7AE" w:sz="4"/>
+              <w:right w:val="single" w:color="D2C7AE" w:sz="4"/>
+            </w:tcBorders>
+            <w:shd w:fill="FDFBF4" w:val="clear"/>
+            <w:vAlign w:val="center"/>
+          </w:tcPr>
+          <w:p>
+            <w:pPr>
+              <w:spacing w:after="40" w:before="40"/>
+            </w:pPr>
+            <w:r>
+              <w:rPr>
+                <w:rFonts w:ascii="Calibri" w:cs="Calibri" w:eastAsia="Calibri" w:hAnsi="Calibri"/>
+                <w:b w:val="false"/>
+                <w:bCs w:val="false"/>
+                <w:color w:val="1F2320"/>
+                <w:sz w:val="18"/>
+                <w:szCs w:val="18"/>
+              </w:rPr>
+              <w:t xml:space="preserve">08.09, PR #60: /materials/textbook — зміст + розділ на кожну тему, коди тем themes.code, посилання з тренажера, підсумку і результатів</w:t>
+            </w:r>
+          </w:p>
+        </w:tc>
+      </w:tr>
+      <w:tr>
+        <w:tc>
+          <w:tcPr>
+            <w:tcW w:type="pct" w:w="25%"/>
+            <w:tcBorders>
+              <w:top w:val="single" w:color="D2C7AE" w:sz="4"/>
+              <w:left w:val="single" w:color="D2C7AE" w:sz="4"/>
+              <w:bottom w:val="single" w:color="D2C7AE" w:sz="4"/>
+              <w:right w:val="single" w:color="D2C7AE" w:sz="4"/>
+            </w:tcBorders>
             <w:shd w:fill="EFE8D7" w:val="clear"/>
             <w:vAlign w:val="center"/>
           </w:tcPr>

</xml_diff>